<commit_message>
Count pricing-card video at 480p, and unbreak Vercel font setup.
Cards show independent 1K image and 8s 480p maxima. Footer now carries the demo modal so /pricing loads. Compositor fonts are vendored because GitHub raw 404 aborted the last production build.

Co-authored-by: Cursor <cursoragent@cursor.com>
</commit_message>
<xml_diff>
--- a/docs/Alchemy-Studio-Token-Economics.docx
+++ b/docs/Alchemy-Studio-Token-Economics.docx
@@ -2824,7 +2824,7 @@
     </w:p>
     <w:p>
       <w:r>
-        <w:t>Pricing cards and the landing capacity grid use estimatePricingCardCapacity() (lib/billing/pricing-card-capacity.ts). Free is the pack together — not the leftover either/or math. Paid cards stay “if you spend the whole grant on one format.”</w:t>
+        <w:t>Pricing cards and the landing capacity grid use estimatePricingCardCapacity(). Each line is an independent maximum prefixed with “Up to”: 1K stills, or 8s 480p video (lowest studio video resolution, 328 tokens). Mixing formats or using 720p/1080p uses more tokens per piece. Section 2 still describes the Free pack that fits together (1 image + 1× 8s 480P).</w:t>
       </w:r>
     </w:p>
     <w:tbl>
@@ -2834,14 +2834,13 @@
         <w:tblLook w:firstColumn="1" w:firstRow="1" w:lastColumn="0" w:lastRow="0" w:noHBand="0" w:noVBand="1" w:val="04A0"/>
       </w:tblPr>
       <w:tblGrid>
-        <w:gridCol w:w="3216"/>
-        <w:gridCol w:w="3216"/>
-        <w:gridCol w:w="3216"/>
+        <w:gridCol w:w="4824"/>
+        <w:gridCol w:w="4824"/>
       </w:tblGrid>
       <w:tr>
         <w:tc>
           <w:tcPr>
-            <w:tcW w:type="dxa" w:w="3216"/>
+            <w:tcW w:type="dxa" w:w="4824"/>
             <w:shd w:fill="1F4E79"/>
           </w:tcPr>
           <w:p>
@@ -2857,7 +2856,7 @@
         </w:tc>
         <w:tc>
           <w:tcPr>
-            <w:tcW w:type="dxa" w:w="3216"/>
+            <w:tcW w:type="dxa" w:w="4824"/>
             <w:shd w:fill="1F4E79"/>
           </w:tcPr>
           <w:p>
@@ -2867,23 +2866,7 @@
                 <w:color w:val="FFFFFF"/>
                 <w:sz w:val="20"/>
               </w:rPr>
-              <w:t>What the pricing card shows</w:t>
-            </w:r>
-          </w:p>
-        </w:tc>
-        <w:tc>
-          <w:tcPr>
-            <w:tcW w:type="dxa" w:w="3216"/>
-            <w:shd w:fill="1F4E79"/>
-          </w:tcPr>
-          <w:p>
-            <w:r>
-              <w:rPr>
-                <w:b/>
-                <w:color w:val="FFFFFF"/>
-                <w:sz w:val="20"/>
-              </w:rPr>
-              <w:t>Together?</w:t>
+              <w:t>Pricing card (independent maxima at 1K / 8s 480p)</w:t>
             </w:r>
           </w:p>
         </w:tc>
@@ -2891,7 +2874,7 @@
       <w:tr>
         <w:tc>
           <w:tcPr>
-            <w:tcW w:type="dxa" w:w="3216"/>
+            <w:tcW w:type="dxa" w:w="4824"/>
           </w:tcPr>
           <w:p>
             <w:r>
@@ -2904,27 +2887,14 @@
         </w:tc>
         <w:tc>
           <w:tcPr>
-            <w:tcW w:type="dxa" w:w="3216"/>
+            <w:tcW w:type="dxa" w:w="4824"/>
           </w:tcPr>
           <w:p>
             <w:r>
               <w:rPr>
                 <w:sz w:val="20"/>
               </w:rPr>
-              <w:t>1 promotional image and 1× 8s 480p video</w:t>
-            </w:r>
-          </w:p>
-        </w:tc>
-        <w:tc>
-          <w:tcPr>
-            <w:tcW w:type="dxa" w:w="3216"/>
-          </w:tcPr>
-          <w:p>
-            <w:r>
-              <w:rPr>
-                <w:sz w:val="20"/>
-              </w:rPr>
-              <w:t>Yes (393 of 500 tokens; 107 buffer)</w:t>
+              <w:t>Up to 7 single images · Up to 1 × 8s 480p videos</w:t>
             </w:r>
           </w:p>
         </w:tc>
@@ -2932,7 +2902,7 @@
       <w:tr>
         <w:tc>
           <w:tcPr>
-            <w:tcW w:type="dxa" w:w="3216"/>
+            <w:tcW w:type="dxa" w:w="4824"/>
           </w:tcPr>
           <w:p>
             <w:r>
@@ -2945,27 +2915,14 @@
         </w:tc>
         <w:tc>
           <w:tcPr>
-            <w:tcW w:type="dxa" w:w="3216"/>
+            <w:tcW w:type="dxa" w:w="4824"/>
           </w:tcPr>
           <w:p>
             <w:r>
               <w:rPr>
                 <w:sz w:val="20"/>
               </w:rPr>
-              <w:t>~46 images or ~5 × 8s 720p (768P billing)</w:t>
-            </w:r>
-          </w:p>
-        </w:tc>
-        <w:tc>
-          <w:tcPr>
-            <w:tcW w:type="dxa" w:w="3216"/>
-          </w:tcPr>
-          <w:p>
-            <w:r>
-              <w:rPr>
-                <w:sz w:val="20"/>
-              </w:rPr>
-              <w:t>No — either/or</w:t>
+              <w:t>Up to 46 single images · Up to 9 × 8s 480p videos</w:t>
             </w:r>
           </w:p>
         </w:tc>
@@ -2973,7 +2930,7 @@
       <w:tr>
         <w:tc>
           <w:tcPr>
-            <w:tcW w:type="dxa" w:w="3216"/>
+            <w:tcW w:type="dxa" w:w="4824"/>
           </w:tcPr>
           <w:p>
             <w:r>
@@ -2986,27 +2943,14 @@
         </w:tc>
         <w:tc>
           <w:tcPr>
-            <w:tcW w:type="dxa" w:w="3216"/>
+            <w:tcW w:type="dxa" w:w="4824"/>
           </w:tcPr>
           <w:p>
             <w:r>
               <w:rPr>
                 <w:sz w:val="20"/>
               </w:rPr>
-              <w:t>~123 images or ~9 × 8s 1080p (2K billing)</w:t>
-            </w:r>
-          </w:p>
-        </w:tc>
-        <w:tc>
-          <w:tcPr>
-            <w:tcW w:type="dxa" w:w="3216"/>
-          </w:tcPr>
-          <w:p>
-            <w:r>
-              <w:rPr>
-                <w:sz w:val="20"/>
-              </w:rPr>
-              <w:t>No — either/or</w:t>
+              <w:t>Up to 123 single images · Up to 24 × 8s 480p videos</w:t>
             </w:r>
           </w:p>
         </w:tc>
@@ -3014,7 +2958,7 @@
       <w:tr>
         <w:tc>
           <w:tcPr>
-            <w:tcW w:type="dxa" w:w="3216"/>
+            <w:tcW w:type="dxa" w:w="4824"/>
           </w:tcPr>
           <w:p>
             <w:r>
@@ -3027,38 +2971,20 @@
         </w:tc>
         <w:tc>
           <w:tcPr>
-            <w:tcW w:type="dxa" w:w="3216"/>
+            <w:tcW w:type="dxa" w:w="4824"/>
           </w:tcPr>
           <w:p>
             <w:r>
               <w:rPr>
                 <w:sz w:val="20"/>
               </w:rPr>
-              <w:t>~246 images or ~18 × 8s 1080p (2K billing)</w:t>
-            </w:r>
-          </w:p>
-        </w:tc>
-        <w:tc>
-          <w:tcPr>
-            <w:tcW w:type="dxa" w:w="3216"/>
-          </w:tcPr>
-          <w:p>
-            <w:r>
-              <w:rPr>
-                <w:sz w:val="20"/>
-              </w:rPr>
-              <w:t>No — either/or</w:t>
+              <w:t>Up to 246 single images · Up to 48 × 8s 480p videos</w:t>
             </w:r>
           </w:p>
         </w:tc>
       </w:tr>
     </w:tbl>
     <w:p/>
-    <w:p>
-      <w:r>
-        <w:t>Do not put ~7 images on the Free card. That number is only the leftover if someone spent the whole 500-token grant on 1K stills and skipped video (estimatePlanApproxCapacity).</w:t>
-      </w:r>
-    </w:p>
     <w:tbl>
       <w:tblPr>
         <w:tblStyle w:val="TableGrid"/>
@@ -3270,7 +3196,7 @@
               <w:rPr>
                 <w:sz w:val="20"/>
               </w:rPr>
-              <w:t>5</w:t>
+              <w:t>9</w:t>
             </w:r>
           </w:p>
         </w:tc>
@@ -3337,7 +3263,7 @@
               <w:rPr>
                 <w:sz w:val="20"/>
               </w:rPr>
-              <w:t>9</w:t>
+              <w:t>24</w:t>
             </w:r>
           </w:p>
         </w:tc>
@@ -3404,7 +3330,7 @@
               <w:rPr>
                 <w:sz w:val="20"/>
               </w:rPr>
-              <w:t>18</w:t>
+              <w:t>48</w:t>
             </w:r>
           </w:p>
         </w:tc>

</xml_diff>